<commit_message>
DOCS : exo tri et recherche
</commit_message>
<xml_diff>
--- a/fonctionRécursive/Fonction récursive.docx
+++ b/fonctionRécursive/Fonction récursive.docx
@@ -1179,13 +1179,7 @@
       </w:r>
       <w:proofErr w:type="gramEnd"/>
       <w:r>
-        <w:t>2, 4) -&gt; attends un 2 x 2</w:t>
-      </w:r>
-      <w:r>
-        <w:t>^(3</w:t>
-      </w:r>
-      <w:r>
-        <w:t>-1)</w:t>
+        <w:t>2, 4) -&gt; attends un 2 x 2^(3-1)</w:t>
       </w:r>
     </w:p>
     <w:p>
@@ -1210,13 +1204,7 @@
       </w:r>
       <w:proofErr w:type="gramEnd"/>
       <w:r>
-        <w:t>2, 4) -&gt; attends un 2 x 2</w:t>
-      </w:r>
-      <w:r>
-        <w:t>^(2</w:t>
-      </w:r>
-      <w:r>
-        <w:t>-1)</w:t>
+        <w:t>2, 4) -&gt; attends un 2 x 2^(2-1)</w:t>
       </w:r>
     </w:p>
     <w:p>
@@ -1244,13 +1232,7 @@
       </w:r>
       <w:proofErr w:type="gramEnd"/>
       <w:r>
-        <w:t>2, 4) -&gt; attends un 2 x 2</w:t>
-      </w:r>
-      <w:r>
-        <w:t>^(1</w:t>
-      </w:r>
-      <w:r>
-        <w:t>-1)</w:t>
+        <w:t>2, 4) -&gt; attends un 2 x 2^(1-1)</w:t>
       </w:r>
     </w:p>
     <w:p>
@@ -1275,11 +1257,21 @@
       <w:r>
         <w:tab/>
       </w:r>
-      <w:r>
-        <w:t>p</w:t>
-      </w:r>
-      <w:r>
-        <w:t>uissance(2, 4) -&gt; Retourner 1</w:t>
+      <w:proofErr w:type="gramStart"/>
+      <w:r>
+        <w:t>puissance(</w:t>
+      </w:r>
+      <w:proofErr w:type="gramEnd"/>
+      <w:r>
+        <w:t>2, 4) -&gt; Retourner 1</w:t>
+      </w:r>
+    </w:p>
+    <w:p>
+      <w:pPr>
+        <w:ind w:firstLine="360"/>
+      </w:pPr>
+      <w:r>
+        <w:t>AFFICHER resultat</w:t>
       </w:r>
       <w:bookmarkStart w:id="0" w:name="_GoBack"/>
       <w:bookmarkEnd w:id="0"/>

</xml_diff>